<commit_message>
fix(docs): restore UTF-8 encoding in Tritonic BB Cookbook.
Regenerate docx after fixing em-dash mojibake from PowerShell merge.

Co-authored-by: Cursor <cursoragent@cursor.com>
</commit_message>
<xml_diff>
--- a/docs/TRITONIC_BB_COOKBOOK.docx
+++ b/docs/TRITONIC_BB_COOKBOOK.docx
@@ -52,69 +52,6 @@
     </w:p>
     <w:p>
       <w:pPr>
-        <w:spacing w:after="140"/>
-      </w:pPr>
-      <w:r>
-        <w:t xml:space="preserve"># Tritonic Big Band Cookbook</w:t>
-      </w:r>
-    </w:p>
-    <w:p>
-      <w:pPr>
-        <w:spacing w:after="140"/>
-      </w:pPr>
-      <w:r>
-        <w:rPr>
-          <w:b/>
-          <w:bCs/>
-        </w:rPr>
-        <w:t xml:space="preserve">Composer OS v1.3.0</w:t>
-      </w:r>
-      <w:r>
-        <w:t xml:space="preserve"> â€” </w:t>
-      </w:r>
-      <w:r>
-        <w:rPr>
-          <w:b/>
-          <w:bCs/>
-        </w:rPr>
-        <w:t xml:space="preserve">60</w:t>
-      </w:r>
-      <w:r>
-        <w:t xml:space="preserve"> scenario recipes for tritonic cell realisation (`bb` Â· `sq` Â· `ecm` modes), Wayne behaviour knobs, and named chord progressions. Each scenario maps a musical goal to engine settings plus a bar-by-bar harmony plan.</w:t>
-      </w:r>
-    </w:p>
-    <w:p>
-      <w:pPr>
-        <w:spacing w:after="140"/>
-      </w:pPr>
-      <w:r>
-        <w:rPr>
-          <w:b/>
-          <w:bCs/>
-        </w:rPr>
-        <w:t xml:space="preserve">Cell families:</w:t>
-      </w:r>
-      <w:r>
-        <w:t xml:space="preserve"> `quartal` Â· `cluster` Â· `suspended` Â· `shorter_floating` Â· `bergonzi`</w:t>
-      </w:r>
-    </w:p>
-    <w:p>
-      <w:pPr>
-        <w:spacing w:after="140"/>
-      </w:pPr>
-      <w:r>
-        <w:rPr>
-          <w:b/>
-          <w:bCs/>
-        </w:rPr>
-        <w:t xml:space="preserve">Realisation modes:</w:t>
-      </w:r>
-      <w:r>
-        <w:t xml:space="preserve"> `bb` (dense, high oddity floor 0.65) Â· `sq` (smooth, oddity cap 0.25) Â· `ecm` (suspended/shorter_floating bias, forced `delayedResolution`)</w:t>
-      </w:r>
-    </w:p>
-    <w:p>
-      <w:pPr>
         <w:pStyle w:val="Heading1"/>
         <w:spacing w:after="140" w:before="280"/>
       </w:pPr>
@@ -123,7 +60,7 @@
           <w:b/>
           <w:bCs/>
         </w:rPr>
-        <w:t xml:space="preserve">Scenario 1 â€” Slow Blues in Bb (Freddie Green)</w:t>
+        <w:t xml:space="preserve">Scenario 1 — Slow Blues in Bb (Freddie Green)</w:t>
       </w:r>
     </w:p>
     <w:p>
@@ -315,7 +252,7 @@
               <w:spacing w:after="60"/>
             </w:pPr>
             <w:r>
-              <w:t xml:space="preserve">I â€” tritonic bergonzi cell on guide tones</w:t>
+              <w:t xml:space="preserve">I — tritonic bergonzi cell on guide tones</w:t>
             </w:r>
           </w:p>
         </w:tc>
@@ -397,7 +334,7 @@
               <w:spacing w:after="60"/>
             </w:pPr>
             <w:r>
-              <w:t xml:space="preserve">IV â€” quartal colour</w:t>
+              <w:t xml:space="preserve">IV — quartal colour</w:t>
             </w:r>
           </w:p>
         </w:tc>
@@ -561,7 +498,7 @@
               <w:spacing w:after="60"/>
             </w:pPr>
             <w:r>
-              <w:t xml:space="preserve">V â€” cluster tension peak</w:t>
+              <w:t xml:space="preserve">V — cluster tension peak</w:t>
             </w:r>
           </w:p>
         </w:tc>
@@ -653,7 +590,7 @@
           <w:b/>
           <w:bCs/>
         </w:rPr>
-        <w:t xml:space="preserve">Scenario 2 â€” Minor Blues in C (ECM Sparse)</w:t>
+        <w:t xml:space="preserve">Scenario 2 — Minor Blues in C (ECM Sparse)</w:t>
       </w:r>
     </w:p>
     <w:p>
@@ -845,7 +782,7 @@
               <w:spacing w:after="60"/>
             </w:pPr>
             <w:r>
-              <w:t xml:space="preserve">i â€” suspended cell</w:t>
+              <w:t xml:space="preserve">i — suspended cell</w:t>
             </w:r>
           </w:p>
         </w:tc>
@@ -927,7 +864,7 @@
               <w:spacing w:after="60"/>
             </w:pPr>
             <w:r>
-              <w:t xml:space="preserve">iv â€” cluster semitone colour</w:t>
+              <w:t xml:space="preserve">iv — cluster semitone colour</w:t>
             </w:r>
           </w:p>
         </w:tc>
@@ -1050,7 +987,7 @@
               <w:spacing w:after="60"/>
             </w:pPr>
             <w:r>
-              <w:t xml:space="preserve">bVI â€” shorter_floating lift</w:t>
+              <w:t xml:space="preserve">bVI — shorter_floating lift</w:t>
             </w:r>
           </w:p>
         </w:tc>
@@ -1091,7 +1028,7 @@
               <w:spacing w:after="60"/>
             </w:pPr>
             <w:r>
-              <w:t xml:space="preserve">V â€” cluster peak</w:t>
+              <w:t xml:space="preserve">V — cluster peak</w:t>
             </w:r>
           </w:p>
         </w:tc>
@@ -1183,7 +1120,7 @@
           <w:b/>
           <w:bCs/>
         </w:rPr>
-        <w:t xml:space="preserve">Scenario 3 â€” Big Band Blues Shout in F</w:t>
+        <w:t xml:space="preserve">Scenario 3 — Big Band Blues Shout in F</w:t>
       </w:r>
     </w:p>
     <w:p>
@@ -1662,7 +1599,7 @@
               <w:spacing w:after="60"/>
             </w:pPr>
             <w:r>
-              <w:t xml:space="preserve">V â†’ I shout tag</w:t>
+              <w:t xml:space="preserve">V → I shout tag</w:t>
             </w:r>
           </w:p>
         </w:tc>
@@ -1713,7 +1650,7 @@
           <w:b/>
           <w:bCs/>
         </w:rPr>
-        <w:t xml:space="preserve">Scenario 4 â€” Simple iiâ€“Vâ€“I in C Major</w:t>
+        <w:t xml:space="preserve">Scenario 4 — Simple ii–V–I in C Major</w:t>
       </w:r>
     </w:p>
     <w:p>
@@ -2066,7 +2003,7 @@
         <w:t xml:space="preserve">Musical notes:</w:t>
       </w:r>
       <w:r>
-        <w:t xml:space="preserve"> SQ mode caps oddity at 0.25 for smooth voice-leading through the canonical iiâ€“Vâ€“I. Pentatonic pattern type keeps cell choices diatonic-friendly; ideal teaching scenario.</w:t>
+        <w:t xml:space="preserve"> SQ mode caps oddity at 0.25 for smooth voice-leading through the canonical ii–V–I. Pentatonic pattern type keeps cell choices diatonic-friendly; ideal teaching scenario.</w:t>
       </w:r>
     </w:p>
     <w:p>
@@ -2079,7 +2016,7 @@
           <w:b/>
           <w:bCs/>
         </w:rPr>
-        <w:t xml:space="preserve">Scenario 5 â€” Advanced iiâ€“Vâ€“I with Tritone Sub</w:t>
+        <w:t xml:space="preserve">Scenario 5 — Advanced ii–V–I with Tritone Sub</w:t>
       </w:r>
     </w:p>
     <w:p>
@@ -2445,7 +2382,7 @@
           <w:b/>
           <w:bCs/>
         </w:rPr>
-        <w:t xml:space="preserve">Scenario 6 â€” Descending iiâ€“Vâ€“I Chain</w:t>
+        <w:t xml:space="preserve">Scenario 6 — Descending ii–V–I Chain</w:t>
       </w:r>
     </w:p>
     <w:p>
@@ -2975,7 +2912,7 @@
           <w:b/>
           <w:bCs/>
         </w:rPr>
-        <w:t xml:space="preserve">Scenario 7 â€” Coltrane Changes</w:t>
+        <w:t xml:space="preserve">Scenario 7 — Coltrane Changes</w:t>
       </w:r>
     </w:p>
     <w:p>
@@ -2990,7 +2927,7 @@
         <w:t xml:space="preserve">Style:</w:t>
       </w:r>
       <w:r>
-        <w:t xml:space="preserve"> Giant Steps cycle Eâ€“Abâ€“Bâ€“D; bergonzi cells; high oddity; delayed resolution.</w:t>
+        <w:t xml:space="preserve"> Giant Steps cycle E–Ab–B–D; bergonzi cells; high oddity; delayed resolution.</w:t>
       </w:r>
     </w:p>
     <w:p>
@@ -3669,7 +3606,7 @@
           <w:b/>
           <w:bCs/>
         </w:rPr>
-        <w:t xml:space="preserve">Scenario 8 â€” Nefertiti-Style (No Resolution)</w:t>
+        <w:t xml:space="preserve">Scenario 8 — Nefertiti-Style (No Resolution)</w:t>
       </w:r>
     </w:p>
     <w:p>
@@ -4148,7 +4085,7 @@
               <w:spacing w:after="60"/>
             </w:pPr>
             <w:r>
-              <w:t xml:space="preserve">no Vâ†’I</w:t>
+              <w:t xml:space="preserve">no V→I</w:t>
             </w:r>
           </w:p>
         </w:tc>
@@ -4199,7 +4136,7 @@
           <w:b/>
           <w:bCs/>
         </w:rPr>
-        <w:t xml:space="preserve">Scenario 9 â€” Infant Eyes Ballad</w:t>
+        <w:t xml:space="preserve">Scenario 9 — Infant Eyes Ballad</w:t>
       </w:r>
     </w:p>
     <w:p>
@@ -4432,7 +4369,7 @@
               <w:spacing w:after="60"/>
             </w:pPr>
             <w:r>
-              <w:t xml:space="preserve">passing iiÃ¸</w:t>
+              <w:t xml:space="preserve">passing iiø</w:t>
             </w:r>
           </w:p>
         </w:tc>
@@ -4729,7 +4666,7 @@
           <w:b/>
           <w:bCs/>
         </w:rPr>
-        <w:t xml:space="preserve">Scenario 10 â€” ECM Floating (No Tonal Centre)</w:t>
+        <w:t xml:space="preserve">Scenario 10 — ECM Floating (No Tonal Centre)</w:t>
       </w:r>
     </w:p>
     <w:p>
@@ -4921,7 +4858,7 @@
               <w:spacing w:after="60"/>
             </w:pPr>
             <w:r>
-              <w:t xml:space="preserve">âˆ†</w:t>
+              <w:t xml:space="preserve">∆</w:t>
             </w:r>
           </w:p>
         </w:tc>
@@ -5246,7 +5183,7 @@
         <w:t xml:space="preserve">Musical notes:</w:t>
       </w:r>
       <w:r>
-        <w:t xml:space="preserve"> Symmetric major-third cycle destroys functional hierarchy â€” ideal ECM use case. Quartal cells stack fourths that ignore tertian chord spelling while still mapping to maj7 surfaces.</w:t>
+        <w:t xml:space="preserve"> Symmetric major-third cycle destroys functional hierarchy — ideal ECM use case. Quartal cells stack fourths that ignore tertian chord spelling while still mapping to maj7 surfaces.</w:t>
       </w:r>
     </w:p>
     <w:p>
@@ -5259,7 +5196,7 @@
           <w:b/>
           <w:bCs/>
         </w:rPr>
-        <w:t xml:space="preserve">Scenario 11 â€” Walk On By (Bacharach Chromatic Descent)</w:t>
+        <w:t xml:space="preserve">Scenario 11 — Walk On By (Bacharach Chromatic Descent)</w:t>
       </w:r>
     </w:p>
     <w:p>
@@ -5776,7 +5713,7 @@
         <w:t xml:space="preserve">Musical notes:</w:t>
       </w:r>
       <w:r>
-        <w:t xml:space="preserve"> Chromatic descending bass (Câ†’C#â†’D) pairs with cluster-adjacent cells on the dim7 bar. Sus4 dominant delays resolution Bacharach-style before G7 release.</w:t>
+        <w:t xml:space="preserve"> Chromatic descending bass (C→C#→D) pairs with cluster-adjacent cells on the dim7 bar. Sus4 dominant delays resolution Bacharach-style before G7 release.</w:t>
       </w:r>
     </w:p>
     <w:p>
@@ -5789,7 +5726,7 @@
           <w:b/>
           <w:bCs/>
         </w:rPr>
-        <w:t xml:space="preserve">Scenario 12 â€” Alfie (Unexpected Modulations)</w:t>
+        <w:t xml:space="preserve">Scenario 12 — Alfie (Unexpected Modulations)</w:t>
       </w:r>
     </w:p>
     <w:p>
@@ -6319,7 +6256,7 @@
           <w:b/>
           <w:bCs/>
         </w:rPr>
-        <w:t xml:space="preserve">Scenario 13 â€” Chromatic Mediant Chain</w:t>
+        <w:t xml:space="preserve">Scenario 13 — Chromatic Mediant Chain</w:t>
       </w:r>
     </w:p>
     <w:p>
@@ -6849,7 +6786,7 @@
           <w:b/>
           <w:bCs/>
         </w:rPr>
-        <w:t xml:space="preserve">Scenario 14 â€” Quartal Harmony (Stacked Fourths)</w:t>
+        <w:t xml:space="preserve">Scenario 14 — Quartal Harmony (Stacked Fourths)</w:t>
       </w:r>
     </w:p>
     <w:p>
@@ -7028,7 +6965,7 @@
               <w:spacing w:after="60"/>
             </w:pPr>
             <w:r>
-              <w:t xml:space="preserve">Câ€“Fâ€“Bb</w:t>
+              <w:t xml:space="preserve">C–F–Bb</w:t>
             </w:r>
           </w:p>
         </w:tc>
@@ -7069,7 +7006,7 @@
               <w:spacing w:after="60"/>
             </w:pPr>
             <w:r>
-              <w:t xml:space="preserve">Dâ€“Gâ€“C</w:t>
+              <w:t xml:space="preserve">D–G–C</w:t>
             </w:r>
           </w:p>
         </w:tc>
@@ -7110,7 +7047,7 @@
               <w:spacing w:after="60"/>
             </w:pPr>
             <w:r>
-              <w:t xml:space="preserve">Eâ€“Aâ€“D</w:t>
+              <w:t xml:space="preserve">E–A–D</w:t>
             </w:r>
           </w:p>
         </w:tc>
@@ -7151,7 +7088,7 @@
               <w:spacing w:after="60"/>
             </w:pPr>
             <w:r>
-              <w:t xml:space="preserve">Câ€“Fâ€“Bb</w:t>
+              <w:t xml:space="preserve">C–F–Bb</w:t>
             </w:r>
           </w:p>
         </w:tc>
@@ -7192,7 +7129,7 @@
               <w:spacing w:after="60"/>
             </w:pPr>
             <w:r>
-              <w:t xml:space="preserve">Fâ€“Bbâ€“Eb</w:t>
+              <w:t xml:space="preserve">F–Bb–Eb</w:t>
             </w:r>
           </w:p>
         </w:tc>
@@ -7233,7 +7170,7 @@
               <w:spacing w:after="60"/>
             </w:pPr>
             <w:r>
-              <w:t xml:space="preserve">Gâ€“Câ€“F</w:t>
+              <w:t xml:space="preserve">G–C–F</w:t>
             </w:r>
           </w:p>
         </w:tc>
@@ -7274,7 +7211,7 @@
               <w:spacing w:after="60"/>
             </w:pPr>
             <w:r>
-              <w:t xml:space="preserve">Aâ€“Dâ€“G</w:t>
+              <w:t xml:space="preserve">A–D–G</w:t>
             </w:r>
           </w:p>
         </w:tc>
@@ -7315,7 +7252,7 @@
               <w:spacing w:after="60"/>
             </w:pPr>
             <w:r>
-              <w:t xml:space="preserve">Câ€“Fâ€“Bb</w:t>
+              <w:t xml:space="preserve">C–F–Bb</w:t>
             </w:r>
           </w:p>
         </w:tc>
@@ -7379,7 +7316,7 @@
           <w:b/>
           <w:bCs/>
         </w:rPr>
-        <w:t xml:space="preserve">Scenario 15 â€” Messiaen Mode 2 (Octatonic)</w:t>
+        <w:t xml:space="preserve">Scenario 15 — Messiaen Mode 2 (Octatonic)</w:t>
       </w:r>
     </w:p>
     <w:p>
@@ -7571,7 +7508,7 @@
               <w:spacing w:after="60"/>
             </w:pPr>
             <w:r>
-              <w:t xml:space="preserve">octatonic iÃ¸</w:t>
+              <w:t xml:space="preserve">octatonic iø</w:t>
             </w:r>
           </w:p>
         </w:tc>
@@ -7896,7 +7833,7 @@
         <w:t xml:space="preserve">Musical notes:</w:t>
       </w:r>
       <w:r>
-        <w:t xml:space="preserve"> Alternating m7b5 and dominant 7th pairs outline octatonic set {0,1,3,4,6,7,9,10}. Cluster cells on Ã¸ chords maximise semitone density.</w:t>
+        <w:t xml:space="preserve"> Alternating m7b5 and dominant 7th pairs outline octatonic set {0,1,3,4,6,7,9,10}. Cluster cells on ø chords maximise semitone density.</w:t>
       </w:r>
     </w:p>
     <w:p>
@@ -7909,7 +7846,7 @@
           <w:b/>
           <w:bCs/>
         </w:rPr>
-        <w:t xml:space="preserve">Scenario 16 â€” Basie Rhythm Changes</w:t>
+        <w:t xml:space="preserve">Scenario 16 — Basie Rhythm Changes</w:t>
       </w:r>
     </w:p>
     <w:p>
@@ -8426,7 +8363,7 @@
         <w:t xml:space="preserve">Musical notes:</w:t>
       </w:r>
       <w:r>
-        <w:t xml:space="preserve"> Classic A-section rhythm changes at Basie tempo; beats_2_4 comping leaves room for brass hits on 1 and 3 while tritonic cells connect upper voices across the iiâ€“V pairs.</w:t>
+        <w:t xml:space="preserve"> Classic A-section rhythm changes at Basie tempo; beats_2_4 comping leaves room for brass hits on 1 and 3 while tritonic cells connect upper voices across the ii–V pairs.</w:t>
       </w:r>
     </w:p>
     <w:p>
@@ -8439,7 +8376,7 @@
           <w:b/>
           <w:bCs/>
         </w:rPr>
-        <w:t xml:space="preserve">Scenario 17 â€” Ellington Ballad</w:t>
+        <w:t xml:space="preserve">Scenario 17 — Ellington Ballad</w:t>
       </w:r>
     </w:p>
     <w:p>
@@ -8969,7 +8906,7 @@
           <w:b/>
           <w:bCs/>
         </w:rPr>
-        <w:t xml:space="preserve">Scenario 18 â€” DADGAD Open Tuning Drone</w:t>
+        <w:t xml:space="preserve">Scenario 18 — DADGAD Open Tuning Drone</w:t>
       </w:r>
     </w:p>
     <w:p>
@@ -9064,7 +9001,7 @@
         <w:t xml:space="preserve">Tuning:</w:t>
       </w:r>
       <w:r>
-        <w:t xml:space="preserve"> capo 0 Â· strings `[62,57,55,50,45,38]` (DADGAD MIDI)</w:t>
+        <w:t xml:space="preserve"> capo 0 · strings `[62,57,55,50,45,38]` (DADGAD MIDI)</w:t>
       </w:r>
     </w:p>
     <w:p>
@@ -9514,7 +9451,7 @@
           <w:b/>
           <w:bCs/>
         </w:rPr>
-        <w:t xml:space="preserve">Scenario 19 â€” Sonic Youth (CGDGCD Power Clash)</w:t>
+        <w:t xml:space="preserve">Scenario 19 — Sonic Youth (CGDGCD Power Clash)</w:t>
       </w:r>
     </w:p>
     <w:p>
@@ -10059,7 +9996,7 @@
           <w:b/>
           <w:bCs/>
         </w:rPr>
-        <w:t xml:space="preserve">Scenario 20 â€” Andrew Hill (Augmented Cycle)</w:t>
+        <w:t xml:space="preserve">Scenario 20 — Andrew Hill (Augmented Cycle)</w:t>
       </w:r>
     </w:p>
     <w:p>
@@ -10238,7 +10175,7 @@
               <w:spacing w:after="60"/>
             </w:pPr>
             <w:r>
-              <w:t xml:space="preserve">Cmâˆ†7</w:t>
+              <w:t xml:space="preserve">Cm∆7</w:t>
             </w:r>
           </w:p>
         </w:tc>
@@ -10279,7 +10216,7 @@
               <w:spacing w:after="60"/>
             </w:pPr>
             <w:r>
-              <w:t xml:space="preserve">Ebmâˆ†7</w:t>
+              <w:t xml:space="preserve">Ebm∆7</w:t>
             </w:r>
           </w:p>
         </w:tc>
@@ -10320,7 +10257,7 @@
               <w:spacing w:after="60"/>
             </w:pPr>
             <w:r>
-              <w:t xml:space="preserve">F#âˆ†7</w:t>
+              <w:t xml:space="preserve">F#∆7</w:t>
             </w:r>
           </w:p>
         </w:tc>
@@ -10361,7 +10298,7 @@
               <w:spacing w:after="60"/>
             </w:pPr>
             <w:r>
-              <w:t xml:space="preserve">Aâˆ†7</w:t>
+              <w:t xml:space="preserve">A∆7</w:t>
             </w:r>
           </w:p>
         </w:tc>
@@ -10402,7 +10339,7 @@
               <w:spacing w:after="60"/>
             </w:pPr>
             <w:r>
-              <w:t xml:space="preserve">Cmâˆ†7</w:t>
+              <w:t xml:space="preserve">Cm∆7</w:t>
             </w:r>
           </w:p>
         </w:tc>
@@ -10443,7 +10380,7 @@
               <w:spacing w:after="60"/>
             </w:pPr>
             <w:r>
-              <w:t xml:space="preserve">Ebmâˆ†7</w:t>
+              <w:t xml:space="preserve">Ebm∆7</w:t>
             </w:r>
           </w:p>
         </w:tc>
@@ -10484,20 +10421,20 @@
               <w:spacing w:after="60"/>
             </w:pPr>
             <w:r>
-              <w:t xml:space="preserve">F#âˆ†7</w:t>
-            </w:r>
-          </w:p>
-        </w:tc>
-        <w:tc>
-          <w:tcPr>
-            <w:tcW w:type="pct" w:w="3000%"/>
-          </w:tcPr>
-          <w:p>
-            <w:pPr>
-              <w:spacing w:after="60"/>
-            </w:pPr>
-            <w:r>
-              <w:t xml:space="preserve">7/4 bar â€” asymmetric feel</w:t>
+              <w:t xml:space="preserve">F#∆7</w:t>
+            </w:r>
+          </w:p>
+        </w:tc>
+        <w:tc>
+          <w:tcPr>
+            <w:tcW w:type="pct" w:w="3000%"/>
+          </w:tcPr>
+          <w:p>
+            <w:pPr>
+              <w:spacing w:after="60"/>
+            </w:pPr>
+            <w:r>
+              <w:t xml:space="preserve">7/4 bar — asymmetric feel</w:t>
             </w:r>
           </w:p>
         </w:tc>
@@ -10548,7 +10485,7 @@
           <w:b/>
           <w:bCs/>
         </w:rPr>
-        <w:t xml:space="preserve">Scenario 21 â€” Thad Jones (Dense Chromatic Inner Voices)</w:t>
+        <w:t xml:space="preserve">Scenario 21 — Thad Jones (Dense Chromatic Inner Voices)</w:t>
       </w:r>
     </w:p>
     <w:p>
@@ -10740,7 +10677,7 @@
               <w:spacing w:after="60"/>
             </w:pPr>
             <w:r>
-              <w:t xml:space="preserve">bIII Lydian â€” Thad colour</w:t>
+              <w:t xml:space="preserve">bIII Lydian — Thad colour</w:t>
             </w:r>
           </w:p>
         </w:tc>
@@ -10781,7 +10718,7 @@
               <w:spacing w:after="60"/>
             </w:pPr>
             <w:r>
-              <w:t xml:space="preserve">passing iiÃ¸</w:t>
+              <w:t xml:space="preserve">passing iiø</w:t>
             </w:r>
           </w:p>
         </w:tc>
@@ -11078,7 +11015,7 @@
           <w:b/>
           <w:bCs/>
         </w:rPr>
-        <w:t xml:space="preserve">Scenario 22 â€” Maria Schneider (Orchestral Swell)</w:t>
+        <w:t xml:space="preserve">Scenario 22 — Maria Schneider (Orchestral Swell)</w:t>
       </w:r>
     </w:p>
     <w:p>
@@ -11608,7 +11545,7 @@
           <w:b/>
           <w:bCs/>
         </w:rPr>
-        <w:t xml:space="preserve">Scenario 23 â€” Donald Fagen (Aja-Style)</w:t>
+        <w:t xml:space="preserve">Scenario 23 — Donald Fagen (Aja-Style)</w:t>
       </w:r>
     </w:p>
     <w:p>
@@ -12125,7 +12062,7 @@
         <w:t xml:space="preserve">Musical notes:</w:t>
       </w:r>
       <w:r>
-        <w:t xml:space="preserve"> Fagen's sus4 dominants delay tertian resolution â€” matching tritonic suspended family behaviour. Chromatic pattern type colours the Em7â†’A7sus4 approach with cluster-adjacent cells without breaking the groove.</w:t>
+        <w:t xml:space="preserve"> Fagen's sus4 dominants delay tertian resolution — matching tritonic suspended family behaviour. Chromatic pattern type colours the Em7→A7sus4 approach with cluster-adjacent cells without breaking the groove.</w:t>
       </w:r>
     </w:p>
     <w:p>
@@ -12138,7 +12075,7 @@
           <w:b/>
           <w:bCs/>
         </w:rPr>
-        <w:t xml:space="preserve">Scenario 24 â€” XTC English Settlement (Slash Chords)</w:t>
+        <w:t xml:space="preserve">Scenario 24 — XTC English Settlement (Slash Chords)</w:t>
       </w:r>
     </w:p>
     <w:p>
@@ -12576,7 +12513,7 @@
               <w:spacing w:after="60"/>
             </w:pPr>
             <w:r>
-              <w:t xml:space="preserve">7/8 â€” asymmetric tag</w:t>
+              <w:t xml:space="preserve">7/8 — asymmetric tag</w:t>
             </w:r>
           </w:p>
         </w:tc>
@@ -12614,7 +12551,7 @@
         <w:t xml:space="preserve">Musical notes:</w:t>
       </w:r>
       <w:r>
-        <w:t xml:space="preserve"> Slash chords decouple bass from upper structure â€” tritonic quartal cells float independently of the bass pedal. 7/8 meter plus offbeats comping mirrors Settlement's angular folk-rock pulse.</w:t>
+        <w:t xml:space="preserve"> Slash chords decouple bass from upper structure — tritonic quartal cells float independently of the bass pedal. 7/8 meter plus offbeats comping mirrors Settlement's angular folk-rock pulse.</w:t>
       </w:r>
     </w:p>
     <w:p>
@@ -12627,7 +12564,7 @@
           <w:b/>
           <w:bCs/>
         </w:rPr>
-        <w:t xml:space="preserve">Scenario 25 â€” Two-Part Counterpoint (Guitarâ€“Bass Duo)</w:t>
+        <w:t xml:space="preserve">Scenario 25 — Two-Part Counterpoint (Guitar–Bass Duo)</w:t>
       </w:r>
     </w:p>
     <w:p>
@@ -12642,7 +12579,7 @@
         <w:t xml:space="preserve">Style:</w:t>
       </w:r>
       <w:r>
-        <w:t xml:space="preserve"> Guitarâ€“bass duo; upper quartal cells against stepwise diatonic bass; open voicing.</w:t>
+        <w:t xml:space="preserve"> Guitar–bass duo; upper quartal cells against stepwise diatonic bass; open voicing.</w:t>
       </w:r>
     </w:p>
     <w:p>
@@ -12819,7 +12756,7 @@
               <w:spacing w:after="60"/>
             </w:pPr>
             <w:r>
-              <w:t xml:space="preserve">I â€” bass root</w:t>
+              <w:t xml:space="preserve">I — bass root</w:t>
             </w:r>
           </w:p>
         </w:tc>
@@ -13157,7 +13094,7 @@
           <w:b/>
           <w:bCs/>
         </w:rPr>
-        <w:t xml:space="preserve">Scenario 26 â€” Fux Species Counterpoint (Third Species)</w:t>
+        <w:t xml:space="preserve">Scenario 26 — Fux Species Counterpoint (Third Species)</w:t>
       </w:r>
     </w:p>
     <w:p>
@@ -13687,7 +13624,7 @@
           <w:b/>
           <w:bCs/>
         </w:rPr>
-        <w:t xml:space="preserve">Scenario 27 â€” Invertible Counterpoint (Voice Swap)</w:t>
+        <w:t xml:space="preserve">Scenario 27 — Invertible Counterpoint (Voice Swap)</w:t>
       </w:r>
     </w:p>
     <w:p>
@@ -13702,7 +13639,7 @@
         <w:t xml:space="preserve">Style:</w:t>
       </w:r>
       <w:r>
-        <w:t xml:space="preserve"> Invertible counterpoint; voices swap at bar 5; guitarâ€“bass duo.</w:t>
+        <w:t xml:space="preserve"> Invertible counterpoint; voices swap at bar 5; guitar–bass duo.</w:t>
       </w:r>
     </w:p>
     <w:p>
@@ -14050,7 +13987,7 @@
               <w:t xml:space="preserve">voice swap</w:t>
             </w:r>
             <w:r>
-              <w:t xml:space="preserve"> â€” upper becomes bass line</w:t>
+              <w:t xml:space="preserve"> — upper becomes bass line</w:t>
             </w:r>
           </w:p>
         </w:tc>
@@ -14224,7 +14161,7 @@
           <w:b/>
           <w:bCs/>
         </w:rPr>
-        <w:t xml:space="preserve">Scenario 28 â€” Messiaen Mode 3 (Limited Transposition)</w:t>
+        <w:t xml:space="preserve">Scenario 28 — Messiaen Mode 3 (Limited Transposition)</w:t>
       </w:r>
     </w:p>
     <w:p>
@@ -14741,7 +14678,7 @@
         <w:t xml:space="preserve">Musical notes:</w:t>
       </w:r>
       <w:r>
-        <w:t xml:space="preserve"> Mode 3's six-pitch set resists functional harmony â€” bergonzi tertian anchors are the only family that maps cleanly to chord export. ECM forced delayedResolution keeps the cycle perpetually unresolved.</w:t>
+        <w:t xml:space="preserve"> Mode 3's six-pitch set resists functional harmony — bergonzi tertian anchors are the only family that maps cleanly to chord export. ECM forced delayedResolution keeps the cycle perpetually unresolved.</w:t>
       </w:r>
     </w:p>
     <w:p>
@@ -14754,7 +14691,7 @@
           <w:b/>
           <w:bCs/>
         </w:rPr>
-        <w:t xml:space="preserve">Scenario 29 â€” Messiaen Mode 4 (Diminished)</w:t>
+        <w:t xml:space="preserve">Scenario 29 — Messiaen Mode 4 (Diminished)</w:t>
       </w:r>
     </w:p>
     <w:p>
@@ -15284,7 +15221,7 @@
           <w:b/>
           <w:bCs/>
         </w:rPr>
-        <w:t xml:space="preserve">Scenario 30 â€” Quartet for the End of Time</w:t>
+        <w:t xml:space="preserve">Scenario 30 — Quartet for the End of Time</w:t>
       </w:r>
     </w:p>
     <w:p>
@@ -15640,7 +15577,7 @@
               <w:spacing w:after="60"/>
             </w:pPr>
             <w:r>
-              <w:t xml:space="preserve">block 2 â€” Lydian shift</w:t>
+              <w:t xml:space="preserve">block 2 — Lydian shift</w:t>
             </w:r>
           </w:p>
         </w:tc>
@@ -15801,7 +15738,7 @@
         <w:t xml:space="preserve">Musical notes:</w:t>
       </w:r>
       <w:r>
-        <w:t xml:space="preserve"> Extreme slowness exposes every semitone in cell voice-leading across four-bar blocks. The Eâ†’Fmaj7#11 shift is a single Messiaen-like colour change without functional dominant.</w:t>
+        <w:t xml:space="preserve"> Extreme slowness exposes every semitone in cell voice-leading across four-bar blocks. The E→Fmaj7#11 shift is a single Messiaen-like colour change without functional dominant.</w:t>
       </w:r>
     </w:p>
     <w:p>
@@ -15814,7 +15751,7 @@
           <w:b/>
           <w:bCs/>
         </w:rPr>
-        <w:t xml:space="preserve">Scenario 31 â€” Completely Atonal (12 Roots)</w:t>
+        <w:t xml:space="preserve">Scenario 31 — Completely Atonal (12 Roots)</w:t>
       </w:r>
     </w:p>
     <w:p>
@@ -16508,7 +16445,7 @@
           <w:b/>
           <w:bCs/>
         </w:rPr>
-        <w:t xml:space="preserve">Scenario 32 â€” Microtonally-Inspired (Semitone Maj7 Chain)</w:t>
+        <w:t xml:space="preserve">Scenario 32 — Microtonally-Inspired (Semitone Maj7 Chain)</w:t>
       </w:r>
     </w:p>
     <w:p>
@@ -17038,7 +16975,7 @@
           <w:b/>
           <w:bCs/>
         </w:rPr>
-        <w:t xml:space="preserve">Scenario 33 â€” Nonsensical Chromatic Explosion</w:t>
+        <w:t xml:space="preserve">Scenario 33 — Nonsensical Chromatic Explosion</w:t>
       </w:r>
     </w:p>
     <w:p>
@@ -17312,7 +17249,7 @@
               <w:spacing w:after="60"/>
             </w:pPr>
             <w:r>
-              <w:t xml:space="preserve">Ã¸ colour</w:t>
+              <w:t xml:space="preserve">ø colour</w:t>
             </w:r>
           </w:p>
         </w:tc>
@@ -17555,7 +17492,7 @@
         <w:t xml:space="preserve">Musical notes:</w:t>
       </w:r>
       <w:r>
-        <w:t xml:space="preserve"> Each bar pivots by unrelated interval â€” testing tritonic voice-leading under extreme harmonic whiplash. BB dense voicing fills the section for cartoon chase-score energy.</w:t>
+        <w:t xml:space="preserve"> Each bar pivots by unrelated interval — testing tritonic voice-leading under extreme harmonic whiplash. BB dense voicing fills the section for cartoon chase-score energy.</w:t>
       </w:r>
     </w:p>
     <w:p>
@@ -17568,7 +17505,7 @@
           <w:b/>
           <w:bCs/>
         </w:rPr>
-        <w:t xml:space="preserve">Scenario 34 â€” Random Walk (Interval Rotation)</w:t>
+        <w:t xml:space="preserve">Scenario 34 — Random Walk (Interval Rotation)</w:t>
       </w:r>
     </w:p>
     <w:p>
@@ -18098,7 +18035,7 @@
           <w:b/>
           <w:bCs/>
         </w:rPr>
-        <w:t xml:space="preserve">Scenario 35 â€” Polymodal (C Major / F# Major)</w:t>
+        <w:t xml:space="preserve">Scenario 35 — Polymodal (C Major / F# Major)</w:t>
       </w:r>
     </w:p>
     <w:p>
@@ -18113,7 +18050,7 @@
         <w:t xml:space="preserve">Style:</w:t>
       </w:r>
       <w:r>
-        <w:t xml:space="preserve"> Polymodal bitonality; C major upper register | F# major lower; guitarâ€“bass duo; high tension.</w:t>
+        <w:t xml:space="preserve"> Polymodal bitonality; C major upper register | F# major lower; guitar–bass duo; high tension.</w:t>
       </w:r>
     </w:p>
     <w:p>
@@ -18628,7 +18565,7 @@
           <w:b/>
           <w:bCs/>
         </w:rPr>
-        <w:t xml:space="preserve">Scenario 36 â€” Lloyd Webber (Deliberate Clash)</w:t>
+        <w:t xml:space="preserve">Scenario 36 — Lloyd Webber (Deliberate Clash)</w:t>
       </w:r>
     </w:p>
     <w:p>
@@ -19158,7 +19095,7 @@
           <w:b/>
           <w:bCs/>
         </w:rPr>
-        <w:t xml:space="preserve">Scenario 37 â€” Samba Jazz (Bossa Offbeats)</w:t>
+        <w:t xml:space="preserve">Scenario 37 — Samba Jazz (Bossa Offbeats)</w:t>
       </w:r>
     </w:p>
     <w:p>
@@ -19350,7 +19287,7 @@
               <w:spacing w:after="60"/>
             </w:pPr>
             <w:r>
-              <w:t xml:space="preserve">iiÃ¸</w:t>
+              <w:t xml:space="preserve">iiø</w:t>
             </w:r>
           </w:p>
         </w:tc>
@@ -19675,7 +19612,7 @@
         <w:t xml:space="preserve">Musical notes:</w:t>
       </w:r>
       <w:r>
-        <w:t xml:space="preserve"> Offbeats comping pattern syncopates against straight harmonic rhythm â€” classic samba jazz feel. Resonant texture supports nylon-string guitar voicings in upper register.</w:t>
+        <w:t xml:space="preserve"> Offbeats comping pattern syncopates against straight harmonic rhythm — classic samba jazz feel. Resonant texture supports nylon-string guitar voicings in upper register.</w:t>
       </w:r>
     </w:p>
     <w:p>
@@ -19688,7 +19625,7 @@
           <w:b/>
           <w:bCs/>
         </w:rPr>
-        <w:t xml:space="preserve">Scenario 38 â€” Nordic Folk Drone</w:t>
+        <w:t xml:space="preserve">Scenario 38 — Nordic Folk Drone</w:t>
       </w:r>
     </w:p>
     <w:p>
@@ -20218,7 +20155,7 @@
           <w:b/>
           <w:bCs/>
         </w:rPr>
-        <w:t xml:space="preserve">Scenario 39 â€” Steve Reich Phase (Additive Bass)</w:t>
+        <w:t xml:space="preserve">Scenario 39 — Steve Reich Phase (Additive Bass)</w:t>
       </w:r>
     </w:p>
     <w:p>
@@ -20748,7 +20685,7 @@
           <w:b/>
           <w:bCs/>
         </w:rPr>
-        <w:t xml:space="preserve">Scenario 40 â€” Cinema Noir (Descending Chromatic)</w:t>
+        <w:t xml:space="preserve">Scenario 40 — Cinema Noir (Descending Chromatic)</w:t>
       </w:r>
     </w:p>
     <w:p>
@@ -21278,7 +21215,7 @@
           <w:b/>
           <w:bCs/>
         </w:rPr>
-        <w:t xml:space="preserve">Scenario 41 â€” Stravinsky Petrushka (Polychord)</w:t>
+        <w:t xml:space="preserve">Scenario 41 — Stravinsky Petrushka (Polychord)</w:t>
       </w:r>
     </w:p>
     <w:p>
@@ -21808,7 +21745,7 @@
           <w:b/>
           <w:bCs/>
         </w:rPr>
-        <w:t xml:space="preserve">Scenario 42 â€” BartÃ³k Night Music (Chromatic Ascent)</w:t>
+        <w:t xml:space="preserve">Scenario 42 — Bartók Night Music (Chromatic Ascent)</w:t>
       </w:r>
     </w:p>
     <w:p>
@@ -21823,7 +21760,7 @@
         <w:t xml:space="preserve">Style:</w:t>
       </w:r>
       <w:r>
-        <w:t xml:space="preserve"> BartÃ³k night music; chromatic ascending minor triads; cluster + bergonzi; ECM mode; very slow.</w:t>
+        <w:t xml:space="preserve"> Bartók night music; chromatic ascending minor triads; cluster + bergonzi; ECM mode; very slow.</w:t>
       </w:r>
     </w:p>
     <w:p>
@@ -22338,7 +22275,7 @@
           <w:b/>
           <w:bCs/>
         </w:rPr>
-        <w:t xml:space="preserve">Scenario 43 â€” Bitonality (Bb / D)</w:t>
+        <w:t xml:space="preserve">Scenario 43 — Bitonality (Bb / D)</w:t>
       </w:r>
     </w:p>
     <w:p>
@@ -22353,7 +22290,7 @@
         <w:t xml:space="preserve">Style:</w:t>
       </w:r>
       <w:r>
-        <w:t xml:space="preserve"> Bitonality; Bbmaj7 upper | Dmaj7 lower; guitarâ€“bass duo; quartal upper, shell lower.</w:t>
+        <w:t xml:space="preserve"> Bitonality; Bbmaj7 upper | Dmaj7 lower; guitar–bass duo; quartal upper, shell lower.</w:t>
       </w:r>
     </w:p>
     <w:p>
@@ -22868,7 +22805,7 @@
           <w:b/>
           <w:bCs/>
         </w:rPr>
-        <w:t xml:space="preserve">Scenario 44 â€” Polymodal Folk (Dorian / Phrygian)</w:t>
+        <w:t xml:space="preserve">Scenario 44 — Polymodal Folk (Dorian / Phrygian)</w:t>
       </w:r>
     </w:p>
     <w:p>
@@ -23398,7 +23335,7 @@
           <w:b/>
           <w:bCs/>
         </w:rPr>
-        <w:t xml:space="preserve">Scenario 45 â€” Lydian over Locrian</w:t>
+        <w:t xml:space="preserve">Scenario 45 — Lydian over Locrian</w:t>
       </w:r>
     </w:p>
     <w:p>
@@ -23915,7 +23852,7 @@
         <w:t xml:space="preserve">Musical notes:</w:t>
       </w:r>
       <w:r>
-        <w:t xml:space="preserve"> Bright Lydian #11 over dark Locrian Ã¸ creates maximum modal contrast. ECM delayedResolution prevents either mode from dominating the other.</w:t>
+        <w:t xml:space="preserve"> Bright Lydian #11 over dark Locrian ø creates maximum modal contrast. ECM delayedResolution prevents either mode from dominating the other.</w:t>
       </w:r>
     </w:p>
     <w:p>
@@ -23928,7 +23865,7 @@
           <w:b/>
           <w:bCs/>
         </w:rPr>
-        <w:t xml:space="preserve">Scenario 46 â€” Hans Zimmer Ostinato (Rising Oddity)</w:t>
+        <w:t xml:space="preserve">Scenario 46 — Hans Zimmer Ostinato (Rising Oddity)</w:t>
       </w:r>
     </w:p>
     <w:p>
@@ -23943,7 +23880,7 @@
         <w:t xml:space="preserve">Style:</w:t>
       </w:r>
       <w:r>
-        <w:t xml:space="preserve"> Hans Zimmer ostinato; iâ€“bVIâ€“bIIIâ€“bVII loop; oddityScore rises 0.2â†’0.8 across sections.</w:t>
+        <w:t xml:space="preserve"> Hans Zimmer ostinato; i–bVI–bIII–bVII loop; oddityScore rises 0.2→0.8 across sections.</w:t>
       </w:r>
     </w:p>
     <w:p>
@@ -23973,7 +23910,7 @@
         <w:t xml:space="preserve">Behaviour:</w:t>
       </w:r>
       <w:r>
-        <w:t xml:space="preserve"> oddityScore 0.20â†’0.80 (section ramp) | delayedResolution false | melodyPriority false</w:t>
+        <w:t xml:space="preserve"> oddityScore 0.20→0.80 (section ramp) | delayedResolution false | melodyPriority false</w:t>
       </w:r>
     </w:p>
     <w:p>
@@ -24120,7 +24057,7 @@
               <w:spacing w:after="60"/>
             </w:pPr>
             <w:r>
-              <w:t xml:space="preserve">i â€” oddity 0.2</w:t>
+              <w:t xml:space="preserve">i — oddity 0.2</w:t>
             </w:r>
           </w:p>
         </w:tc>
@@ -24284,7 +24221,7 @@
               <w:spacing w:after="60"/>
             </w:pPr>
             <w:r>
-              <w:t xml:space="preserve">repeat â€” oddity 0.5</w:t>
+              <w:t xml:space="preserve">repeat — oddity 0.5</w:t>
             </w:r>
           </w:p>
         </w:tc>
@@ -24407,7 +24344,7 @@
               <w:spacing w:after="60"/>
             </w:pPr>
             <w:r>
-              <w:t xml:space="preserve">peak â€” oddity 0.8</w:t>
+              <w:t xml:space="preserve">peak — oddity 0.8</w:t>
             </w:r>
           </w:p>
         </w:tc>
@@ -24458,7 +24395,7 @@
           <w:b/>
           <w:bCs/>
         </w:rPr>
-        <w:t xml:space="preserve">Scenario 47 â€” Bernard Herrmann Psycho (Alternating Minors)</w:t>
+        <w:t xml:space="preserve">Scenario 47 — Bernard Herrmann Psycho (Alternating Minors)</w:t>
       </w:r>
     </w:p>
     <w:p>
@@ -24988,7 +24925,7 @@
           <w:b/>
           <w:bCs/>
         </w:rPr>
-        <w:t xml:space="preserve">Scenario 48 â€” Ennio Morricone Western</w:t>
+        <w:t xml:space="preserve">Scenario 48 — Ennio Morricone Western</w:t>
       </w:r>
     </w:p>
     <w:p>
@@ -25518,7 +25455,7 @@
           <w:b/>
           <w:bCs/>
         </w:rPr>
-        <w:t xml:space="preserve">Scenario 49 â€” John Barry Bond Style</w:t>
+        <w:t xml:space="preserve">Scenario 49 — John Barry Bond Style</w:t>
       </w:r>
     </w:p>
     <w:p>
@@ -25833,7 +25770,7 @@
               <w:spacing w:after="60"/>
             </w:pPr>
             <w:r>
-              <w:t xml:space="preserve">iiÃ¸</w:t>
+              <w:t xml:space="preserve">iiø</w:t>
             </w:r>
           </w:p>
         </w:tc>
@@ -26048,7 +25985,7 @@
           <w:b/>
           <w:bCs/>
         </w:rPr>
-        <w:t xml:space="preserve">Scenario 50 â€” Nino Rota Fellini Circus</w:t>
+        <w:t xml:space="preserve">Scenario 50 — Nino Rota Fellini Circus</w:t>
       </w:r>
     </w:p>
     <w:p>
@@ -26565,7 +26502,7 @@
         <w:t xml:space="preserve">Musical notes:</w:t>
       </w:r>
       <w:r>
-        <w:t xml:space="preserve"> Rota's circus harmony jumps by unexpected intervals in waltz time. 3/4 meter changes tritonic phrase plan cadence feel â€” cells align to three-beat bars.</w:t>
+        <w:t xml:space="preserve"> Rota's circus harmony jumps by unexpected intervals in waltz time. 3/4 meter changes tritonic phrase plan cadence feel — cells align to three-beat bars.</w:t>
       </w:r>
     </w:p>
     <w:p>
@@ -26578,7 +26515,7 @@
           <w:b/>
           <w:bCs/>
         </w:rPr>
-        <w:t xml:space="preserve">Scenario 51 â€” Jerry Goldsmith Atonal (12-Tone Row)</w:t>
+        <w:t xml:space="preserve">Scenario 51 — Jerry Goldsmith Atonal (12-Tone Row)</w:t>
       </w:r>
     </w:p>
     <w:p>
@@ -27272,7 +27209,7 @@
           <w:b/>
           <w:bCs/>
         </w:rPr>
-        <w:t xml:space="preserve">Scenario 52 â€” Polyrhythmic Polymodal</w:t>
+        <w:t xml:space="preserve">Scenario 52 — Polyrhythmic Polymodal</w:t>
       </w:r>
     </w:p>
     <w:p>
@@ -27802,7 +27739,7 @@
           <w:b/>
           <w:bCs/>
         </w:rPr>
-        <w:t xml:space="preserve">Scenario 53 â€” Thomas Newman Suburban (Static Unease)</w:t>
+        <w:t xml:space="preserve">Scenario 53 — Thomas Newman Suburban (Static Unease)</w:t>
       </w:r>
     </w:p>
     <w:p>
@@ -28319,7 +28256,7 @@
         <w:t xml:space="preserve">Musical notes:</w:t>
       </w:r>
       <w:r>
-        <w:t xml:space="preserve"> Harmonic stasis is deliberate â€” shorter_floating cells supply unease through voice-leading drift without changing chords. Newman-style suburban dread in sparse ECM texture.</w:t>
+        <w:t xml:space="preserve"> Harmonic stasis is deliberate — shorter_floating cells supply unease through voice-leading drift without changing chords. Newman-style suburban dread in sparse ECM texture.</w:t>
       </w:r>
     </w:p>
     <w:p>
@@ -28332,7 +28269,7 @@
           <w:b/>
           <w:bCs/>
         </w:rPr>
-        <w:t xml:space="preserve">Scenario 54 â€” Jonny Greenwood (There Will Be Blood)</w:t>
+        <w:t xml:space="preserve">Scenario 54 — Jonny Greenwood (There Will Be Blood)</w:t>
       </w:r>
     </w:p>
     <w:p>
@@ -28862,7 +28799,7 @@
           <w:b/>
           <w:bCs/>
         </w:rPr>
-        <w:t xml:space="preserve">Scenario 55 â€” Shostakovich Ironic Waltz</w:t>
+        <w:t xml:space="preserve">Scenario 55 — Shostakovich Ironic Waltz</w:t>
       </w:r>
     </w:p>
     <w:p>
@@ -29341,7 +29278,7 @@
               <w:spacing w:after="60"/>
             </w:pPr>
             <w:r>
-              <w:t xml:space="preserve">major cadence â€” ironic</w:t>
+              <w:t xml:space="preserve">major cadence — ironic</w:t>
             </w:r>
           </w:p>
         </w:tc>
@@ -29392,7 +29329,7 @@
           <w:b/>
           <w:bCs/>
         </w:rPr>
-        <w:t xml:space="preserve">Scenario 56 â€” Miles Sketches of Spain (Phrygian / Dorian)</w:t>
+        <w:t xml:space="preserve">Scenario 56 — Miles Sketches of Spain (Phrygian / Dorian)</w:t>
       </w:r>
     </w:p>
     <w:p>
@@ -29407,7 +29344,7 @@
         <w:t xml:space="preserve">Style:</w:t>
       </w:r>
       <w:r>
-        <w:t xml:space="preserve"> Miles *Sketches of Spain*; E Phrygian upper | E Dorian lower; guitarâ€“bass duo; open voicing.</w:t>
+        <w:t xml:space="preserve"> Miles *Sketches of Spain*; E Phrygian upper | E Dorian lower; guitar–bass duo; open voicing.</w:t>
       </w:r>
     </w:p>
     <w:p>
@@ -29922,7 +29859,7 @@
           <w:b/>
           <w:bCs/>
         </w:rPr>
-        <w:t xml:space="preserve">Scenario 57 â€” Stealth Cinematic Tension</w:t>
+        <w:t xml:space="preserve">Scenario 57 — Stealth Cinematic Tension</w:t>
       </w:r>
     </w:p>
     <w:p>
@@ -30114,7 +30051,7 @@
               <w:spacing w:after="60"/>
             </w:pPr>
             <w:r>
-              <w:t xml:space="preserve">âˆ†</w:t>
+              <w:t xml:space="preserve">∆</w:t>
             </w:r>
           </w:p>
         </w:tc>
@@ -30452,7 +30389,7 @@
           <w:b/>
           <w:bCs/>
         </w:rPr>
-        <w:t xml:space="preserve">Scenario 58 â€” Polychordal Cluster Bomb</w:t>
+        <w:t xml:space="preserve">Scenario 58 — Polychordal Cluster Bomb</w:t>
       </w:r>
     </w:p>
     <w:p>
@@ -30982,7 +30919,7 @@
           <w:b/>
           <w:bCs/>
         </w:rPr>
-        <w:t xml:space="preserve">Scenario 59 â€” John Adams Minimalist Swell</w:t>
+        <w:t xml:space="preserve">Scenario 59 — John Adams Minimalist Swell</w:t>
       </w:r>
     </w:p>
     <w:p>
@@ -31512,7 +31449,7 @@
           <w:b/>
           <w:bCs/>
         </w:rPr>
-        <w:t xml:space="preserve">Scenario 60 â€” Max Richter Post-Minimal</w:t>
+        <w:t xml:space="preserve">Scenario 60 — Max Richter Post-Minimal</w:t>
       </w:r>
     </w:p>
     <w:p>
@@ -32114,7 +32051,7 @@
               <w:spacing w:after="60"/>
             </w:pPr>
             <w:r>
-              <w:t xml:space="preserve">`bb` Â· `sq` Â· `ecm`</w:t>
+              <w:t xml:space="preserve">`bb` · `sq` · `ecm`</w:t>
             </w:r>
           </w:p>
         </w:tc>
@@ -32142,7 +32079,7 @@
               <w:spacing w:after="60"/>
             </w:pPr>
             <w:r>
-              <w:t xml:space="preserve">`sparse` Â· `resonant` Â· `suspended` Â· `dense` Â· `medium`</w:t>
+              <w:t xml:space="preserve">`sparse` · `resonant` · `suspended` · `dense` · `medium`</w:t>
             </w:r>
           </w:p>
         </w:tc>
@@ -32170,7 +32107,7 @@
               <w:spacing w:after="60"/>
             </w:pPr>
             <w:r>
-              <w:t xml:space="preserve">`close` Â· `open` Â· `mixed` Â· `shell_voicing` Â· `full_chord`</w:t>
+              <w:t xml:space="preserve">`close` · `open` · `mixed` · `shell_voicing` · `full_chord`</w:t>
             </w:r>
           </w:p>
         </w:tc>
@@ -32198,7 +32135,7 @@
               <w:spacing w:after="60"/>
             </w:pPr>
             <w:r>
-              <w:t xml:space="preserve">`easy` Â· `medium` Â· `hard`</w:t>
+              <w:t xml:space="preserve">`easy` · `medium` · `hard`</w:t>
             </w:r>
           </w:p>
         </w:tc>
@@ -32226,7 +32163,7 @@
               <w:spacing w:after="60"/>
             </w:pPr>
             <w:r>
-              <w:t xml:space="preserve">`pentatonic` Â· `chromatic` Â· `whole_tone`</w:t>
+              <w:t xml:space="preserve">`pentatonic` · `chromatic` · `whole_tone`</w:t>
             </w:r>
           </w:p>
         </w:tc>
@@ -32254,7 +32191,7 @@
               <w:spacing w:after="60"/>
             </w:pPr>
             <w:r>
-              <w:t xml:space="preserve">`beats_2_4` Â· `beats_1_3` Â· `all_beats` Â· `offbeats`</w:t>
+              <w:t xml:space="preserve">`beats_2_4` · `beats_1_3` · `all_beats` · `offbeats`</w:t>
             </w:r>
           </w:p>
         </w:tc>
@@ -32277,7 +32214,7 @@
         <w:t xml:space="preserve">Implementation:</w:t>
       </w:r>
       <w:r>
-        <w:t xml:space="preserve"> `realiseTritonic()` â†’ `realisationToMusicContext()` in `engines/composer-os-v2/core/tritonic/tritonicRealisation.ts`. Cookbook progressions are user-facing harmony plans; cell realisation fills upper-structure motion via voice-leading + Wayne behaviour layer.</w:t>
+        <w:t xml:space="preserve"> `realiseTritonic()` → `realisationToMusicContext()` in `engines/composer-os-v2/core/tritonic/tritonicRealisation.ts`. Cookbook progressions are user-facing harmony plans; cell realisation fills upper-structure motion via voice-leading + Wayne behaviour layer.</w:t>
       </w:r>
     </w:p>
     <w:sectPr>

</xml_diff>